<commit_message>
Enlarge message date field in CPODSite.
</commit_message>
<xml_diff>
--- a/CPODSite/CPOD_Site_Information_v20260307.docx
+++ b/CPODSite/CPOD_Site_Information_v20260307.docx
@@ -451,8 +451,8 @@
       </w:tblPr>
       <w:tblGrid>
         <w:gridCol w:w="540"/>
-        <w:gridCol w:w="1440"/>
-        <w:gridCol w:w="2070"/>
+        <w:gridCol w:w="1620"/>
+        <w:gridCol w:w="1890"/>
         <w:gridCol w:w="540"/>
         <w:gridCol w:w="720"/>
         <w:gridCol w:w="90"/>
@@ -551,7 +551,7 @@
         </w:trPr>
         <w:tc>
           <w:tcPr>
-            <w:tcW w:w="1980" w:type="dxa"/>
+            <w:tcW w:w="2160" w:type="dxa"/>
             <w:gridSpan w:val="2"/>
             <w:tcBorders>
               <w:left w:val="single" w:sz="24" w:space="0" w:color="auto"/>
@@ -586,7 +586,7 @@
         </w:tc>
         <w:tc>
           <w:tcPr>
-            <w:tcW w:w="2070" w:type="dxa"/>
+            <w:tcW w:w="1890" w:type="dxa"/>
             <w:tcBorders>
               <w:left w:val="single" w:sz="4" w:space="0" w:color="auto"/>
               <w:bottom w:val="single" w:sz="8" w:space="0" w:color="auto"/>

</xml_diff>